<commit_message>
Record authenticator replacement Preview and verification evidence
</commit_message>
<xml_diff>
--- a/docs/reports/2026-10-16-authenticator-replacement.docx
+++ b/docs/reports/2026-10-16-authenticator-replacement.docx
@@ -906,7 +906,17 @@
     </w:p>
     <w:p>
       <w:r>
-        <w:t xml:space="preserve">The reviewed code/report will be committed and pushed on </w:t>
+        <w:t xml:space="preserve">The twenty-one reviewed files are committed and pushed at </w:t>
+      </w:r>
+      <w:r>
+        <w:rPr>
+          <w:rFonts w:ascii="Consolas" w:hAnsi="Consolas"/>
+          <w:sz w:val="20"/>
+        </w:rPr>
+        <w:t>e43f2e75fa2d186584a3343b14c59b6d7867b840</w:t>
+      </w:r>
+      <w:r>
+        <w:t xml:space="preserve"> on </w:t>
       </w:r>
       <w:r>
         <w:rPr>
@@ -916,7 +926,7 @@
         <w:t>codex/phase-1-mfa-privileged-security</w:t>
       </w:r>
       <w:r>
-        <w:t xml:space="preserve">; exact source and Preview evidence will be recorded after delivery. No merge or Production promotion is authorized by this report's local passes. Main/Production remains </w:t>
+        <w:t xml:space="preserve">. Independent remote refs confirm the review source and unchanged main. No merge or Production promotion occurred. Main/Production remains </w:t>
       </w:r>
       <w:r>
         <w:rPr>
@@ -926,7 +936,17 @@
         <w:t>a6736376b09ba7c3242495ff86b4bb2eea62f20c</w:t>
       </w:r>
       <w:r>
-        <w:t>. The preceding [provider-guard Preview](https://virtual-f2xm5ktgv-shadowrootsec-5679.vercel.app) does not contain this slice. Hosted application acceptance remains pending.</w:t>
+        <w:t xml:space="preserve">. Vercel issued deployment </w:t>
+      </w:r>
+      <w:r>
+        <w:rPr>
+          <w:rFonts w:ascii="Consolas" w:hAnsi="Consolas"/>
+          <w:sz w:val="20"/>
+        </w:rPr>
+        <w:t>dpl_HX3eGspkxybi5DqZxJSPUJYvYnVS</w:t>
+      </w:r>
+      <w:r>
+        <w:t xml:space="preserve"> at [replacement Preview](https://virtual-fhdkhjksp-shadowrootsec-5679.vercel.app), with matching commit/gitSource and review branch. Its final read-only state is READY, target Preview. At 2026-10-16T18:06:09.307Z all four fresh credential-free probes were BLOCKED by deployment protection: three GETs returned Vercel SSO redirects and the POST returned Vercel's 401. Zero application passes are claimed. No private cookie/bypass token was retrieved and no protection setting changed. Source hosting neither applies the four pending migrations nor configures isolated Auth, the hook or credentials. Final evidence delivery changes documentation only; no runtime source follows the verified source commit. The user next-env edit and supplied assets remain unstaged. This is source delivery with blocked hosted acceptance, not phase closure. The preceding [provider-guard Preview](https://virtual-f2xm5ktgv-shadowrootsec-5679.vercel.app) does not contain this slice. Hosted application acceptance remains pending.</w:t>
       </w:r>
     </w:p>
     <w:p>

</xml_diff>